<commit_message>
docs: update week01 formatting to match proposal
</commit_message>
<xml_diff>
--- a/documentation/CSE4204-8D-T01_Week01.docx
+++ b/documentation/CSE4204-8D-T01_Week01.docx
@@ -13,25 +13,7 @@
           <w:color w:val="777777"/>
           <w:sz w:val="20"/>
         </w:rPr>
-        <w:t xml:space="preserve">COURSE CODE: CSE </w:t>
-      </w:r>
-      <w:proofErr w:type="gramStart"/>
-      <w:r>
-        <w:rPr>
-          <w:b/>
-          <w:color w:val="777777"/>
-          <w:sz w:val="20"/>
-        </w:rPr>
-        <w:t>4204  |</w:t>
-      </w:r>
-      <w:proofErr w:type="gramEnd"/>
-      <w:r>
-        <w:rPr>
-          <w:b/>
-          <w:color w:val="777777"/>
-          <w:sz w:val="20"/>
-        </w:rPr>
-        <w:t xml:space="preserve">  COURSE TITLE: MOBILE COMPUTING LAB</w:t>
+        <w:t>COURSE CODE: CSE 4204  |  COURSE TITLE: MOBILE COMPUTING LAB</w:t>
       </w:r>
       <w:r>
         <w:rPr>
@@ -137,9 +119,12 @@
         <w:tblW w:w="0" w:type="auto"/>
         <w:jc w:val="center"/>
         <w:tblBorders>
-          <w:top w:val="single" w:sz="4" w:space="0" w:color="D3D3D3"/>
-          <w:bottom w:val="single" w:sz="4" w:space="0" w:color="D3D3D3"/>
-          <w:insideH w:val="single" w:sz="4" w:space="0" w:color="D3D3D3"/>
+          <w:top w:val="single" w:sz="4" w:space="0" w:color="auto"/>
+          <w:left w:val="single" w:sz="4" w:space="0" w:color="auto"/>
+          <w:bottom w:val="single" w:sz="4" w:space="0" w:color="auto"/>
+          <w:right w:val="single" w:sz="4" w:space="0" w:color="auto"/>
+          <w:insideH w:val="single" w:sz="4" w:space="0" w:color="auto"/>
+          <w:insideV w:val="single" w:sz="4" w:space="0" w:color="auto"/>
         </w:tblBorders>
         <w:tblLook w:val="04A0" w:firstRow="1" w:lastRow="0" w:firstColumn="1" w:lastColumn="0" w:noHBand="0" w:noVBand="1"/>
       </w:tblPr>
@@ -639,218 +624,245 @@
         <w:t>The abstract architectural organization of the full-stack system is structurally structured as follows to ensure strict decoupled development across backend APIs, machine learning pipelines, and responsive frontend client layers:</w:t>
       </w:r>
     </w:p>
+    <w:tbl>
+      <w:tblPr>
+        <w:tblStyle w:val="TableGrid"/>
+        <w:tblW w:w="0" w:type="auto"/>
+        <w:tblLook w:val="04A0" w:firstRow="1" w:lastRow="0" w:firstColumn="1" w:lastColumn="0" w:noHBand="0" w:noVBand="1"/>
+      </w:tblPr>
+      <w:tblGrid>
+        <w:gridCol w:w="9576"/>
+      </w:tblGrid>
+      <w:tr>
+        <w:tc>
+          <w:tcPr>
+            <w:tcW w:w="9576" w:type="dxa"/>
+          </w:tcPr>
+          <w:p>
+            <w:pPr>
+              <w:spacing w:after="240"/>
+              <w:ind w:left="360"/>
+            </w:pPr>
+            <w:proofErr w:type="spellStart"/>
+            <w:r>
+              <w:rPr>
+                <w:rFonts w:ascii="Consolas" w:hAnsi="Consolas"/>
+                <w:color w:val="333333"/>
+                <w:sz w:val="19"/>
+              </w:rPr>
+              <w:t>nubtk_copilot</w:t>
+            </w:r>
+            <w:proofErr w:type="spellEnd"/>
+            <w:r>
+              <w:rPr>
+                <w:rFonts w:ascii="Consolas" w:hAnsi="Consolas"/>
+                <w:color w:val="333333"/>
+                <w:sz w:val="19"/>
+              </w:rPr>
+              <w:t>/                         [System Root Environment]</w:t>
+            </w:r>
+            <w:r>
+              <w:rPr>
+                <w:rFonts w:ascii="Consolas" w:hAnsi="Consolas"/>
+                <w:color w:val="333333"/>
+                <w:sz w:val="19"/>
+              </w:rPr>
+              <w:br/>
+              <w:t>├── backend/                           [Django 5.0 Core Framework Services]</w:t>
+            </w:r>
+            <w:r>
+              <w:rPr>
+                <w:rFonts w:ascii="Consolas" w:hAnsi="Consolas"/>
+                <w:color w:val="333333"/>
+                <w:sz w:val="19"/>
+              </w:rPr>
+              <w:br/>
+              <w:t>│   ├── core/                          [Global System Settings &amp; Routing Policies]</w:t>
+            </w:r>
+            <w:r>
+              <w:rPr>
+                <w:rFonts w:ascii="Consolas" w:hAnsi="Consolas"/>
+                <w:color w:val="333333"/>
+                <w:sz w:val="19"/>
+              </w:rPr>
+              <w:br/>
+              <w:t xml:space="preserve">│   ├── </w:t>
+            </w:r>
+            <w:proofErr w:type="spellStart"/>
+            <w:r>
+              <w:rPr>
+                <w:rFonts w:ascii="Consolas" w:hAnsi="Consolas"/>
+                <w:color w:val="333333"/>
+                <w:sz w:val="19"/>
+              </w:rPr>
+              <w:t>api</w:t>
+            </w:r>
+            <w:proofErr w:type="spellEnd"/>
+            <w:r>
+              <w:rPr>
+                <w:rFonts w:ascii="Consolas" w:hAnsi="Consolas"/>
+                <w:color w:val="333333"/>
+                <w:sz w:val="19"/>
+              </w:rPr>
+              <w:t xml:space="preserve">/                           [REST </w:t>
+            </w:r>
+            <w:proofErr w:type="spellStart"/>
+            <w:r>
+              <w:rPr>
+                <w:rFonts w:ascii="Consolas" w:hAnsi="Consolas"/>
+                <w:color w:val="333333"/>
+                <w:sz w:val="19"/>
+              </w:rPr>
+              <w:t>ViewSets</w:t>
+            </w:r>
+            <w:proofErr w:type="spellEnd"/>
+            <w:r>
+              <w:rPr>
+                <w:rFonts w:ascii="Consolas" w:hAnsi="Consolas"/>
+                <w:color w:val="333333"/>
+                <w:sz w:val="19"/>
+              </w:rPr>
+              <w:t xml:space="preserve"> &amp; Standardized Data Serializers]</w:t>
+            </w:r>
+            <w:r>
+              <w:rPr>
+                <w:rFonts w:ascii="Consolas" w:hAnsi="Consolas"/>
+                <w:color w:val="333333"/>
+                <w:sz w:val="19"/>
+              </w:rPr>
+              <w:br/>
+              <w:t>│   └── apps/                          [Decoupled Domain Service Architectures]</w:t>
+            </w:r>
+            <w:r>
+              <w:rPr>
+                <w:rFonts w:ascii="Consolas" w:hAnsi="Consolas"/>
+                <w:color w:val="333333"/>
+                <w:sz w:val="19"/>
+              </w:rPr>
+              <w:br/>
+              <w:t>│       ├── academics/                 [Enrollments, Secure Gateway Payments, Records]</w:t>
+            </w:r>
+            <w:r>
+              <w:rPr>
+                <w:rFonts w:ascii="Consolas" w:hAnsi="Consolas"/>
+                <w:color w:val="333333"/>
+                <w:sz w:val="19"/>
+              </w:rPr>
+              <w:br/>
+              <w:t xml:space="preserve">│       ├── </w:t>
+            </w:r>
+            <w:proofErr w:type="spellStart"/>
+            <w:r>
+              <w:rPr>
+                <w:rFonts w:ascii="Consolas" w:hAnsi="Consolas"/>
+                <w:color w:val="333333"/>
+                <w:sz w:val="19"/>
+              </w:rPr>
+              <w:t>ai_mentor</w:t>
+            </w:r>
+            <w:proofErr w:type="spellEnd"/>
+            <w:r>
+              <w:rPr>
+                <w:rFonts w:ascii="Consolas" w:hAnsi="Consolas"/>
+                <w:color w:val="333333"/>
+                <w:sz w:val="19"/>
+              </w:rPr>
+              <w:t xml:space="preserve">/                 [LLM Chat Interface &amp; </w:t>
+            </w:r>
+            <w:proofErr w:type="spellStart"/>
+            <w:r>
+              <w:rPr>
+                <w:rFonts w:ascii="Consolas" w:hAnsi="Consolas"/>
+                <w:color w:val="333333"/>
+                <w:sz w:val="19"/>
+              </w:rPr>
+              <w:t>OpenRouter</w:t>
+            </w:r>
+            <w:proofErr w:type="spellEnd"/>
+            <w:r>
+              <w:rPr>
+                <w:rFonts w:ascii="Consolas" w:hAnsi="Consolas"/>
+                <w:color w:val="333333"/>
+                <w:sz w:val="19"/>
+              </w:rPr>
+              <w:t xml:space="preserve"> Integrations]</w:t>
+            </w:r>
+            <w:r>
+              <w:rPr>
+                <w:rFonts w:ascii="Consolas" w:hAnsi="Consolas"/>
+                <w:color w:val="333333"/>
+                <w:sz w:val="19"/>
+              </w:rPr>
+              <w:br/>
+              <w:t xml:space="preserve">│       └── </w:t>
+            </w:r>
+            <w:proofErr w:type="spellStart"/>
+            <w:r>
+              <w:rPr>
+                <w:rFonts w:ascii="Consolas" w:hAnsi="Consolas"/>
+                <w:color w:val="333333"/>
+                <w:sz w:val="19"/>
+              </w:rPr>
+              <w:t>ai_ml_engine</w:t>
+            </w:r>
+            <w:proofErr w:type="spellEnd"/>
+            <w:r>
+              <w:rPr>
+                <w:rFonts w:ascii="Consolas" w:hAnsi="Consolas"/>
+                <w:color w:val="333333"/>
+                <w:sz w:val="19"/>
+              </w:rPr>
+              <w:t>/              [Scikit-Learn Regression &amp; Skill-Gap Matrix]</w:t>
+            </w:r>
+            <w:r>
+              <w:rPr>
+                <w:rFonts w:ascii="Consolas" w:hAnsi="Consolas"/>
+                <w:color w:val="333333"/>
+                <w:sz w:val="19"/>
+              </w:rPr>
+              <w:br/>
+              <w:t xml:space="preserve">├── </w:t>
+            </w:r>
+            <w:proofErr w:type="spellStart"/>
+            <w:r>
+              <w:rPr>
+                <w:rFonts w:ascii="Consolas" w:hAnsi="Consolas"/>
+                <w:color w:val="333333"/>
+                <w:sz w:val="19"/>
+              </w:rPr>
+              <w:t>portal_web</w:t>
+            </w:r>
+            <w:proofErr w:type="spellEnd"/>
+            <w:r>
+              <w:rPr>
+                <w:rFonts w:ascii="Consolas" w:hAnsi="Consolas"/>
+                <w:color w:val="333333"/>
+                <w:sz w:val="19"/>
+              </w:rPr>
+              <w:t>/                        [Lightweight Front-End Templates &amp; Context Views]</w:t>
+            </w:r>
+            <w:r>
+              <w:rPr>
+                <w:rFonts w:ascii="Consolas" w:hAnsi="Consolas"/>
+                <w:color w:val="333333"/>
+                <w:sz w:val="19"/>
+              </w:rPr>
+              <w:br/>
+              <w:t>└── static/                            [Compiled Tailwind Design Tokens &amp; Asset Blobs]</w:t>
+            </w:r>
+          </w:p>
+          <w:p>
+            <w:pPr>
+              <w:spacing w:after="120"/>
+            </w:pPr>
+          </w:p>
+        </w:tc>
+      </w:tr>
+    </w:tbl>
     <w:p>
       <w:pPr>
-        <w:spacing w:after="240"/>
-        <w:ind w:left="360"/>
+        <w:spacing w:after="120"/>
       </w:pPr>
-      <w:proofErr w:type="spellStart"/>
-      <w:r>
-        <w:rPr>
-          <w:rFonts w:ascii="Consolas" w:hAnsi="Consolas"/>
-          <w:color w:val="333333"/>
-          <w:sz w:val="19"/>
-        </w:rPr>
-        <w:t>nubtk_copilot</w:t>
-      </w:r>
-      <w:proofErr w:type="spellEnd"/>
-      <w:r>
-        <w:rPr>
-          <w:rFonts w:ascii="Consolas" w:hAnsi="Consolas"/>
-          <w:color w:val="333333"/>
-          <w:sz w:val="19"/>
-        </w:rPr>
-        <w:t>/                         [System Root Environment]</w:t>
-      </w:r>
-      <w:r>
-        <w:rPr>
-          <w:rFonts w:ascii="Consolas" w:hAnsi="Consolas"/>
-          <w:color w:val="333333"/>
-          <w:sz w:val="19"/>
-        </w:rPr>
-        <w:br/>
-        <w:t>├── backend/                           [Django 5.0 Core Framework Services]</w:t>
-      </w:r>
-      <w:r>
-        <w:rPr>
-          <w:rFonts w:ascii="Consolas" w:hAnsi="Consolas"/>
-          <w:color w:val="333333"/>
-          <w:sz w:val="19"/>
-        </w:rPr>
-        <w:br/>
-        <w:t>│   ├── core/                          [Global System Settings &amp; Routing Policies]</w:t>
-      </w:r>
-      <w:r>
-        <w:rPr>
-          <w:rFonts w:ascii="Consolas" w:hAnsi="Consolas"/>
-          <w:color w:val="333333"/>
-          <w:sz w:val="19"/>
-        </w:rPr>
-        <w:br/>
-        <w:t xml:space="preserve">│   ├── </w:t>
-      </w:r>
-      <w:proofErr w:type="spellStart"/>
-      <w:r>
-        <w:rPr>
-          <w:rFonts w:ascii="Consolas" w:hAnsi="Consolas"/>
-          <w:color w:val="333333"/>
-          <w:sz w:val="19"/>
-        </w:rPr>
-        <w:t>api</w:t>
-      </w:r>
-      <w:proofErr w:type="spellEnd"/>
-      <w:r>
-        <w:rPr>
-          <w:rFonts w:ascii="Consolas" w:hAnsi="Consolas"/>
-          <w:color w:val="333333"/>
-          <w:sz w:val="19"/>
-        </w:rPr>
-        <w:t xml:space="preserve">/                           [REST </w:t>
-      </w:r>
-      <w:proofErr w:type="spellStart"/>
-      <w:r>
-        <w:rPr>
-          <w:rFonts w:ascii="Consolas" w:hAnsi="Consolas"/>
-          <w:color w:val="333333"/>
-          <w:sz w:val="19"/>
-        </w:rPr>
-        <w:t>ViewSets</w:t>
-      </w:r>
-      <w:proofErr w:type="spellEnd"/>
-      <w:r>
-        <w:rPr>
-          <w:rFonts w:ascii="Consolas" w:hAnsi="Consolas"/>
-          <w:color w:val="333333"/>
-          <w:sz w:val="19"/>
-        </w:rPr>
-        <w:t xml:space="preserve"> &amp; Standardized Data Serializers]</w:t>
-      </w:r>
-      <w:r>
-        <w:rPr>
-          <w:rFonts w:ascii="Consolas" w:hAnsi="Consolas"/>
-          <w:color w:val="333333"/>
-          <w:sz w:val="19"/>
-        </w:rPr>
-        <w:br/>
-        <w:t>│   └── apps/                          [Decoupled Domain Service Architectures]</w:t>
-      </w:r>
-      <w:r>
-        <w:rPr>
-          <w:rFonts w:ascii="Consolas" w:hAnsi="Consolas"/>
-          <w:color w:val="333333"/>
-          <w:sz w:val="19"/>
-        </w:rPr>
-        <w:br/>
-        <w:t>│       ├── academics/                 [Enrollments, Secure Gateway Payments, Records]</w:t>
-      </w:r>
-      <w:r>
-        <w:rPr>
-          <w:rFonts w:ascii="Consolas" w:hAnsi="Consolas"/>
-          <w:color w:val="333333"/>
-          <w:sz w:val="19"/>
-        </w:rPr>
-        <w:br/>
-        <w:t xml:space="preserve">│       ├── </w:t>
-      </w:r>
-      <w:proofErr w:type="spellStart"/>
-      <w:r>
-        <w:rPr>
-          <w:rFonts w:ascii="Consolas" w:hAnsi="Consolas"/>
-          <w:color w:val="333333"/>
-          <w:sz w:val="19"/>
-        </w:rPr>
-        <w:t>ai_mentor</w:t>
-      </w:r>
-      <w:proofErr w:type="spellEnd"/>
-      <w:r>
-        <w:rPr>
-          <w:rFonts w:ascii="Consolas" w:hAnsi="Consolas"/>
-          <w:color w:val="333333"/>
-          <w:sz w:val="19"/>
-        </w:rPr>
-        <w:t xml:space="preserve">/                 [LLM Chat Interface &amp; </w:t>
-      </w:r>
-      <w:proofErr w:type="spellStart"/>
-      <w:r>
-        <w:rPr>
-          <w:rFonts w:ascii="Consolas" w:hAnsi="Consolas"/>
-          <w:color w:val="333333"/>
-          <w:sz w:val="19"/>
-        </w:rPr>
-        <w:t>OpenRouter</w:t>
-      </w:r>
-      <w:proofErr w:type="spellEnd"/>
-      <w:r>
-        <w:rPr>
-          <w:rFonts w:ascii="Consolas" w:hAnsi="Consolas"/>
-          <w:color w:val="333333"/>
-          <w:sz w:val="19"/>
-        </w:rPr>
-        <w:t xml:space="preserve"> Integrations]</w:t>
-      </w:r>
-      <w:r>
-        <w:rPr>
-          <w:rFonts w:ascii="Consolas" w:hAnsi="Consolas"/>
-          <w:color w:val="333333"/>
-          <w:sz w:val="19"/>
-        </w:rPr>
-        <w:br/>
-        <w:t xml:space="preserve">│       └── </w:t>
-      </w:r>
-      <w:proofErr w:type="spellStart"/>
-      <w:r>
-        <w:rPr>
-          <w:rFonts w:ascii="Consolas" w:hAnsi="Consolas"/>
-          <w:color w:val="333333"/>
-          <w:sz w:val="19"/>
-        </w:rPr>
-        <w:t>ai_ml_engine</w:t>
-      </w:r>
-      <w:proofErr w:type="spellEnd"/>
-      <w:r>
-        <w:rPr>
-          <w:rFonts w:ascii="Consolas" w:hAnsi="Consolas"/>
-          <w:color w:val="333333"/>
-          <w:sz w:val="19"/>
-        </w:rPr>
-        <w:t>/              [Scikit-Learn Regression &amp; Skill-Gap Matrix]</w:t>
-      </w:r>
-      <w:r>
-        <w:rPr>
-          <w:rFonts w:ascii="Consolas" w:hAnsi="Consolas"/>
-          <w:color w:val="333333"/>
-          <w:sz w:val="19"/>
-        </w:rPr>
-        <w:br/>
-        <w:t xml:space="preserve">├── </w:t>
-      </w:r>
-      <w:proofErr w:type="spellStart"/>
-      <w:r>
-        <w:rPr>
-          <w:rFonts w:ascii="Consolas" w:hAnsi="Consolas"/>
-          <w:color w:val="333333"/>
-          <w:sz w:val="19"/>
-        </w:rPr>
-        <w:t>portal_web</w:t>
-      </w:r>
-      <w:proofErr w:type="spellEnd"/>
-      <w:r>
-        <w:rPr>
-          <w:rFonts w:ascii="Consolas" w:hAnsi="Consolas"/>
-          <w:color w:val="333333"/>
-          <w:sz w:val="19"/>
-        </w:rPr>
-        <w:t>/                        [Lightweight Front-End Templates &amp; Context Views]</w:t>
-      </w:r>
-      <w:r>
-        <w:rPr>
-          <w:rFonts w:ascii="Consolas" w:hAnsi="Consolas"/>
-          <w:color w:val="333333"/>
-          <w:sz w:val="19"/>
-        </w:rPr>
-        <w:br/>
-        <w:t>└── static/                            [Compiled Tailwind Design Tokens &amp; Asset Blobs]</w:t>
-      </w:r>
     </w:p>
     <w:p>
       <w:pPr>
@@ -871,9 +883,12 @@
         <w:tblW w:w="0" w:type="auto"/>
         <w:jc w:val="center"/>
         <w:tblBorders>
-          <w:top w:val="single" w:sz="4" w:space="0" w:color="D3D3D3"/>
-          <w:bottom w:val="single" w:sz="4" w:space="0" w:color="D3D3D3"/>
-          <w:insideH w:val="single" w:sz="4" w:space="0" w:color="D3D3D3"/>
+          <w:top w:val="single" w:sz="4" w:space="0" w:color="auto"/>
+          <w:left w:val="single" w:sz="4" w:space="0" w:color="auto"/>
+          <w:bottom w:val="single" w:sz="4" w:space="0" w:color="auto"/>
+          <w:right w:val="single" w:sz="4" w:space="0" w:color="auto"/>
+          <w:insideH w:val="single" w:sz="4" w:space="0" w:color="auto"/>
+          <w:insideV w:val="single" w:sz="4" w:space="0" w:color="auto"/>
         </w:tblBorders>
         <w:tblLook w:val="04A0" w:firstRow="1" w:lastRow="0" w:firstColumn="1" w:lastColumn="0" w:noHBand="0" w:noVBand="1"/>
       </w:tblPr>
@@ -1099,6 +1114,7 @@
               <w:rPr>
                 <w:b/>
               </w:rPr>
+              <w:lastRenderedPageBreak/>
               <w:t>Intelligent Engine Layer</w:t>
             </w:r>
           </w:p>
@@ -1121,11 +1137,7 @@
             </w:r>
             <w:proofErr w:type="spellEnd"/>
             <w:r>
-              <w:t xml:space="preserve"> API (Claude 3) &amp; </w:t>
-            </w:r>
-            <w:r>
-              <w:lastRenderedPageBreak/>
-              <w:t>Scikit-Learn</w:t>
+              <w:t xml:space="preserve"> API (Claude 3) &amp; Scikit-Learn</w:t>
             </w:r>
           </w:p>
         </w:tc>
@@ -1142,12 +1154,7 @@
           </w:tcPr>
           <w:p>
             <w:r>
-              <w:lastRenderedPageBreak/>
-              <w:t xml:space="preserve">Claude 3 models yield superior semantic code explanations </w:t>
-            </w:r>
-            <w:r>
-              <w:lastRenderedPageBreak/>
-              <w:t>and contextual reasoning parameters. Scikit-learn implements high-performance, deterministic local predictive student evaluation models.</w:t>
+              <w:t>Claude 3 models yield superior semantic code explanations and contextual reasoning parameters. Scikit-learn implements high-performance, deterministic local predictive student evaluation models.</w:t>
             </w:r>
           </w:p>
         </w:tc>
@@ -1172,7 +1179,6 @@
               <w:rPr>
                 <w:b/>
               </w:rPr>
-              <w:lastRenderedPageBreak/>
               <w:t>Client Presentation Layer</w:t>
             </w:r>
           </w:p>

</xml_diff>